<commit_message>
2LD: Fully implement code and report
</commit_message>
<xml_diff>
--- a/1LD/1LD.docx
+++ b/1LD/1LD.docx
@@ -396,6 +396,7 @@
         <w:pStyle w:val="ISIAntrat10"/>
       </w:pPr>
       <w:r>
+        <w:lastRenderedPageBreak/>
         <w:t>Užduotis</w:t>
       </w:r>
     </w:p>
@@ -429,6 +430,7 @@
       <w:r>
         <w:t xml:space="preserve">Naudojant </w:t>
       </w:r>
+      <w:proofErr w:type="spellStart"/>
       <w:r>
         <w:rPr>
           <w:i/>
@@ -443,6 +445,7 @@
         </w:rPr>
         <w:t>olang</w:t>
       </w:r>
+      <w:proofErr w:type="spellEnd"/>
       <w:r>
         <w:rPr>
           <w:i/>
@@ -451,10 +454,18 @@
         <w:t xml:space="preserve"> </w:t>
       </w:r>
       <w:r>
-        <w:t xml:space="preserve">programavimo kalbą, implementavau </w:t>
-      </w:r>
-      <w:r>
-        <w:t>intervalo dalijimo pusiau</w:t>
+        <w:t xml:space="preserve">programavimo kalbą, </w:t>
+      </w:r>
+      <w:proofErr w:type="spellStart"/>
+      <w:r>
+        <w:t>implementavau</w:t>
+      </w:r>
+      <w:proofErr w:type="spellEnd"/>
+      <w:r>
+        <w:t xml:space="preserve"> intervalo dalijimo pusiau</w:t>
+      </w:r>
+      <w:r>
+        <w:t xml:space="preserve"> </w:t>
       </w:r>
       <w:r>
         <w:t xml:space="preserve">(žr. </w:t>
@@ -481,10 +492,7 @@
         <w:t>, auksinio pjūvio</w:t>
       </w:r>
       <w:r>
-        <w:t xml:space="preserve"> </w:t>
-      </w:r>
-      <w:r>
-        <w:t xml:space="preserve">(žr. </w:t>
+        <w:t xml:space="preserve"> (žr. </w:t>
       </w:r>
       <w:r>
         <w:fldChar w:fldCharType="begin"/>
@@ -508,10 +516,7 @@
         <w:t xml:space="preserve"> ir Niutono metodo algoritmus</w:t>
       </w:r>
       <w:r>
-        <w:t xml:space="preserve"> </w:t>
-      </w:r>
-      <w:r>
-        <w:t xml:space="preserve">(žr. </w:t>
+        <w:t xml:space="preserve"> (žr. </w:t>
       </w:r>
       <w:r>
         <w:fldChar w:fldCharType="begin"/>
@@ -541,13 +546,8 @@
       </w:pPr>
       <w:bookmarkStart w:id="1" w:name="_Hlk223296690"/>
       <w:r>
-        <w:t>I</w:t>
-      </w:r>
-      <w:r>
-        <w:t>ntervalo dalijimo pusiau</w:t>
-      </w:r>
-      <w:r>
-        <w:t xml:space="preserve"> algoritmas</w:t>
+        <w:lastRenderedPageBreak/>
+        <w:t>Intervalo dalijimo pusiau algoritmas</w:t>
       </w:r>
     </w:p>
     <w:bookmarkEnd w:id="1"/>
@@ -605,21 +605,11 @@
       <w:r>
         <w:t xml:space="preserve">pav. </w:t>
       </w:r>
-      <w:r>
-        <w:fldChar w:fldCharType="begin"/>
-      </w:r>
-      <w:r>
-        <w:instrText xml:space="preserve"> SEQ pav. \* ARABIC </w:instrText>
-      </w:r>
-      <w:r>
-        <w:fldChar w:fldCharType="separate"/>
-      </w:r>
-      <w:r>
-        <w:t>1</w:t>
-      </w:r>
-      <w:r>
-        <w:fldChar w:fldCharType="end"/>
-      </w:r>
+      <w:fldSimple w:instr=" SEQ pav. \* ARABIC ">
+        <w:r>
+          <w:t>1</w:t>
+        </w:r>
+      </w:fldSimple>
       <w:bookmarkEnd w:id="2"/>
       <w:r>
         <w:t xml:space="preserve"> Intervalo dalijimo pusiau algoritmo kodas</w:t>
@@ -630,6 +620,7 @@
         <w:pStyle w:val="ISIAntrat2"/>
       </w:pPr>
       <w:r>
+        <w:lastRenderedPageBreak/>
         <w:t>Auksinio pjūvio algoritmas</w:t>
       </w:r>
     </w:p>
@@ -687,21 +678,11 @@
       <w:r>
         <w:t xml:space="preserve">pav. </w:t>
       </w:r>
-      <w:r>
-        <w:fldChar w:fldCharType="begin"/>
-      </w:r>
-      <w:r>
-        <w:instrText xml:space="preserve"> SEQ pav. \* ARABIC </w:instrText>
-      </w:r>
-      <w:r>
-        <w:fldChar w:fldCharType="separate"/>
-      </w:r>
-      <w:r>
-        <w:t>2</w:t>
-      </w:r>
-      <w:r>
-        <w:fldChar w:fldCharType="end"/>
-      </w:r>
+      <w:fldSimple w:instr=" SEQ pav. \* ARABIC ">
+        <w:r>
+          <w:t>2</w:t>
+        </w:r>
+      </w:fldSimple>
       <w:bookmarkEnd w:id="3"/>
       <w:r>
         <w:t xml:space="preserve"> Auksinio pjūvio algoritmo kodas</w:t>
@@ -712,6 +693,7 @@
         <w:pStyle w:val="ISIAntrat2"/>
       </w:pPr>
       <w:r>
+        <w:lastRenderedPageBreak/>
         <w:t>Niutono metodo algoritmas</w:t>
       </w:r>
     </w:p>
@@ -778,24 +760,17 @@
       <w:r>
         <w:t xml:space="preserve">pav. </w:t>
       </w:r>
-      <w:r>
-        <w:fldChar w:fldCharType="begin"/>
-      </w:r>
-      <w:r>
-        <w:instrText xml:space="preserve"> SEQ pav. \* ARABIC </w:instrText>
-      </w:r>
-      <w:r>
-        <w:fldChar w:fldCharType="separate"/>
-      </w:r>
-      <w:r>
-        <w:t>3</w:t>
-      </w:r>
-      <w:r>
-        <w:fldChar w:fldCharType="end"/>
-      </w:r>
+      <w:fldSimple w:instr=" SEQ pav. \* ARABIC ">
+        <w:r>
+          <w:t>3</w:t>
+        </w:r>
+      </w:fldSimple>
       <w:bookmarkEnd w:id="4"/>
       <w:r>
-        <w:t xml:space="preserve"> Niutono metodo algoritmo koda</w:t>
+        <w:t xml:space="preserve"> Niutono metodo algoritmo </w:t>
+      </w:r>
+      <w:r>
+        <w:t>kodas</w:t>
       </w:r>
     </w:p>
     <w:p>
@@ -917,10 +892,7 @@
         <w:t>studento</w:t>
       </w:r>
       <w:r>
-        <w:t xml:space="preserve"> kodą, nustačiau A ir B reikšmes 3 ir 9 </w:t>
-      </w:r>
-      <w:r>
-        <w:t xml:space="preserve">(žr. </w:t>
+        <w:t xml:space="preserve"> kodą, nustačiau A ir B reikšmes 3 ir 9 (žr. </w:t>
       </w:r>
       <w:r>
         <w:fldChar w:fldCharType="begin"/>
@@ -938,10 +910,7 @@
         <w:fldChar w:fldCharType="end"/>
       </w:r>
       <w:r>
-        <w:t>)</w:t>
-      </w:r>
-      <w:r>
-        <w:t xml:space="preserve">. </w:t>
+        <w:t xml:space="preserve">). </w:t>
       </w:r>
     </w:p>
     <w:p>
@@ -998,21 +967,11 @@
       <w:r>
         <w:t xml:space="preserve">pav. </w:t>
       </w:r>
-      <w:r>
-        <w:fldChar w:fldCharType="begin"/>
-      </w:r>
-      <w:r>
-        <w:instrText xml:space="preserve"> SEQ pav. \* ARABIC </w:instrText>
-      </w:r>
-      <w:r>
-        <w:fldChar w:fldCharType="separate"/>
-      </w:r>
-      <w:r>
-        <w:t>4</w:t>
-      </w:r>
-      <w:r>
-        <w:fldChar w:fldCharType="end"/>
-      </w:r>
+      <w:fldSimple w:instr=" SEQ pav. \* ARABIC ">
+        <w:r>
+          <w:t>4</w:t>
+        </w:r>
+      </w:fldSimple>
       <w:bookmarkEnd w:id="5"/>
       <w:r>
         <w:t xml:space="preserve"> A ir B reikšmės</w:t>
@@ -1046,15 +1005,32 @@
       <w:r>
         <w:t xml:space="preserve"> perrašiau </w:t>
       </w:r>
+      <w:proofErr w:type="spellStart"/>
       <w:r>
         <w:rPr>
           <w:i/>
           <w:iCs/>
         </w:rPr>
-        <w:t xml:space="preserve">Golang </w:t>
-      </w:r>
-      <w:r>
-        <w:t>kalboje bendrąja forma (t.y. ne specifinėms A ir B reikšmėms)</w:t>
+        <w:t>Golang</w:t>
+      </w:r>
+      <w:proofErr w:type="spellEnd"/>
+      <w:r>
+        <w:rPr>
+          <w:i/>
+          <w:iCs/>
+        </w:rPr>
+        <w:t xml:space="preserve"> </w:t>
+      </w:r>
+      <w:r>
+        <w:t>kalboje bendrąja forma (</w:t>
+      </w:r>
+      <w:proofErr w:type="spellStart"/>
+      <w:r>
+        <w:t>t.y</w:t>
+      </w:r>
+      <w:proofErr w:type="spellEnd"/>
+      <w:r>
+        <w:t>. nespecifinėms A ir B reikšmėms)</w:t>
       </w:r>
       <w:r>
         <w:t xml:space="preserve"> (žr. </w:t>
@@ -1132,21 +1108,11 @@
       <w:r>
         <w:t xml:space="preserve">pav. </w:t>
       </w:r>
-      <w:r>
-        <w:fldChar w:fldCharType="begin"/>
-      </w:r>
-      <w:r>
-        <w:instrText xml:space="preserve"> SEQ pav. \* ARABIC </w:instrText>
-      </w:r>
-      <w:r>
-        <w:fldChar w:fldCharType="separate"/>
-      </w:r>
-      <w:r>
-        <w:t>5</w:t>
-      </w:r>
-      <w:r>
-        <w:fldChar w:fldCharType="end"/>
-      </w:r>
+      <w:fldSimple w:instr=" SEQ pav. \* ARABIC ">
+        <w:r>
+          <w:t>5</w:t>
+        </w:r>
+      </w:fldSimple>
       <w:bookmarkEnd w:id="6"/>
       <w:r>
         <w:t xml:space="preserve"> Tikslo funkcija, 1-o</w:t>
@@ -1257,21 +1223,11 @@
       <w:r>
         <w:t xml:space="preserve">pav. </w:t>
       </w:r>
-      <w:r>
-        <w:fldChar w:fldCharType="begin"/>
-      </w:r>
-      <w:r>
-        <w:instrText xml:space="preserve"> SEQ pav. \* ARABIC </w:instrText>
-      </w:r>
-      <w:r>
-        <w:fldChar w:fldCharType="separate"/>
-      </w:r>
-      <w:r>
-        <w:t>6</w:t>
-      </w:r>
-      <w:r>
-        <w:fldChar w:fldCharType="end"/>
-      </w:r>
+      <w:fldSimple w:instr=" SEQ pav. \* ARABIC ">
+        <w:r>
+          <w:t>6</w:t>
+        </w:r>
+      </w:fldSimple>
       <w:bookmarkEnd w:id="7"/>
       <w:r>
         <w:t xml:space="preserve"> Tyrimo terminalo išvestis</w:t>
@@ -1282,6 +1238,7 @@
         <w:pStyle w:val="ISIAntrat2"/>
       </w:pPr>
       <w:r>
+        <w:lastRenderedPageBreak/>
         <w:t>Išvados</w:t>
       </w:r>
     </w:p>
@@ -1292,6 +1249,7 @@
       <w:r>
         <w:t xml:space="preserve">Atlikus tyrimą, palyginau gautus rezultatus. Svarbu paminėti, kad tikroji </w:t>
       </w:r>
+      <w:proofErr w:type="spellStart"/>
       <w:r>
         <w:rPr>
           <w:i/>
@@ -1299,6 +1257,7 @@
         </w:rPr>
         <w:t>xMin</w:t>
       </w:r>
+      <w:proofErr w:type="spellEnd"/>
       <w:r>
         <w:t xml:space="preserve"> vertė</w:t>
       </w:r>
@@ -1386,9 +1345,6 @@
     <w:p>
       <w:pPr>
         <w:pStyle w:val="ISISraas"/>
-        <w:rPr>
-          <w:lang w:val="en-US"/>
-        </w:rPr>
       </w:pPr>
       <w:r>
         <w:t xml:space="preserve">Lyginant su kitais: </w:t>
@@ -1401,9 +1357,6 @@
           <w:ilvl w:val="1"/>
           <w:numId w:val="2"/>
         </w:numPr>
-        <w:rPr>
-          <w:lang w:val="en-US"/>
-        </w:rPr>
       </w:pPr>
       <w:r>
         <w:t>A</w:t>
@@ -1434,9 +1387,6 @@
           <w:ilvl w:val="1"/>
           <w:numId w:val="2"/>
         </w:numPr>
-        <w:rPr>
-          <w:lang w:val="en-US"/>
-        </w:rPr>
       </w:pPr>
       <w:r>
         <w:t xml:space="preserve">Iš visų algoritmų </w:t>
@@ -1452,14 +1402,7 @@
           <w:i/>
           <w:iCs/>
         </w:rPr>
-        <w:t>f(x)</w:t>
-      </w:r>
-      <w:r>
-        <w:rPr>
-          <w:i/>
-          <w:iCs/>
-        </w:rPr>
-        <w:t xml:space="preserve"> </w:t>
+        <w:t xml:space="preserve">f(x) </w:t>
       </w:r>
       <w:r>
         <w:t>reikšmę</w:t>
@@ -1548,9 +1491,6 @@
     <w:p>
       <w:pPr>
         <w:pStyle w:val="ISISraas"/>
-        <w:rPr>
-          <w:lang w:val="en-US"/>
-        </w:rPr>
       </w:pPr>
       <w:r>
         <w:t xml:space="preserve">Lyginant su kitais: </w:t>
@@ -1694,9 +1634,6 @@
     <w:p>
       <w:pPr>
         <w:pStyle w:val="ISISraas"/>
-        <w:rPr>
-          <w:lang w:val="en-US"/>
-        </w:rPr>
       </w:pPr>
       <w:r>
         <w:t xml:space="preserve">Lyginant su kitais: </w:t>
@@ -1735,7 +1672,13 @@
         </w:numPr>
       </w:pPr>
       <w:r>
-        <w:t>Vienintelis algoritmas, naudojęs išvestines (realus efektyvumas priklausytų nuo išvestinių apskaičiavimo kainos)</w:t>
+        <w:t>Vienintelis algoritmas, naudojęs išvestines</w:t>
+      </w:r>
+      <w:r>
+        <w:t xml:space="preserve">, todėl </w:t>
+      </w:r>
+      <w:r>
+        <w:t>realus efektyvumas priklausytų nuo išvestinių apskaičiavimo kainos</w:t>
       </w:r>
     </w:p>
     <w:p>
@@ -1746,9 +1689,6 @@
     <w:p>
       <w:pPr>
         <w:pStyle w:val="ISIAntrat1"/>
-        <w:rPr>
-          <w:lang w:val="en-US"/>
-        </w:rPr>
       </w:pPr>
       <w:r>
         <w:t>Vizualizuokite tikslo funkciją ir bandymo taškus.</w:t>
@@ -1757,136 +1697,83 @@
     <w:p>
       <w:pPr>
         <w:pStyle w:val="ISITekstas"/>
-        <w:rPr>
-          <w:lang w:val="en-US"/>
-        </w:rPr>
-      </w:pPr>
-      <w:r>
-        <w:rPr>
-          <w:lang w:val="en-US"/>
-        </w:rPr>
+      </w:pPr>
+      <w:r>
         <w:t xml:space="preserve">Naudojantis </w:t>
       </w:r>
+      <w:proofErr w:type="spellStart"/>
       <w:r>
         <w:rPr>
           <w:i/>
           <w:iCs/>
-          <w:lang w:val="en-US"/>
-        </w:rPr>
-        <w:t>gonum plot</w:t>
-      </w:r>
-      <w:r>
-        <w:rPr>
-          <w:lang w:val="en-US"/>
-        </w:rPr>
-        <w:t xml:space="preserve"> biblioteka, nubrėžiau grafiką, rodantį tikslo funkciją, apibrėžtą ribose [1, 10]</w:t>
-      </w:r>
-      <w:r>
-        <w:rPr>
-          <w:lang w:val="en-US"/>
-        </w:rPr>
-        <w:t xml:space="preserve"> bei visų 3 algoritmų bandymo taškus</w:t>
-      </w:r>
-      <w:r>
-        <w:rPr>
-          <w:lang w:val="en-US"/>
-        </w:rPr>
-        <w:t xml:space="preserve"> (žr. </w:t>
-      </w:r>
-      <w:r>
-        <w:rPr>
-          <w:lang w:val="en-US"/>
-        </w:rPr>
-        <w:fldChar w:fldCharType="begin"/>
-      </w:r>
-      <w:r>
-        <w:rPr>
-          <w:lang w:val="en-US"/>
-        </w:rPr>
-        <w:instrText xml:space="preserve"> REF _Ref223298953 \h </w:instrText>
-      </w:r>
-      <w:r>
-        <w:rPr>
-          <w:lang w:val="en-US"/>
-        </w:rPr>
-      </w:r>
-      <w:r>
-        <w:rPr>
-          <w:lang w:val="en-US"/>
-        </w:rPr>
-        <w:fldChar w:fldCharType="separate"/>
-      </w:r>
-      <w:r>
-        <w:t>pav. 7</w:t>
-      </w:r>
-      <w:r>
-        <w:rPr>
-          <w:lang w:val="en-US"/>
-        </w:rPr>
-        <w:fldChar w:fldCharType="end"/>
-      </w:r>
-      <w:r>
-        <w:rPr>
-          <w:lang w:val="en-US"/>
-        </w:rPr>
-        <w:t>)</w:t>
-      </w:r>
-      <w:r>
-        <w:rPr>
-          <w:lang w:val="en-US"/>
-        </w:rPr>
-        <w:t xml:space="preserve">. Tam, kad taškai būtų lengviau matomi, </w:t>
-      </w:r>
+        </w:rPr>
+        <w:t>gonum</w:t>
+      </w:r>
+      <w:proofErr w:type="spellEnd"/>
       <w:r>
         <w:rPr>
           <w:i/>
           <w:iCs/>
-          <w:lang w:val="en-US"/>
-        </w:rPr>
-        <w:t>x</w:t>
-      </w:r>
-      <w:r>
-        <w:rPr>
-          <w:lang w:val="en-US"/>
-        </w:rPr>
-        <w:t xml:space="preserve"> ir </w:t>
+        </w:rPr>
+        <w:t xml:space="preserve"> plot</w:t>
+      </w:r>
+      <w:r>
+        <w:t xml:space="preserve"> biblioteka, nubrėžiau grafiką, rodantį tikslo funkciją, apibrėžtą ribose [1, 10]</w:t>
+      </w:r>
+      <w:r>
+        <w:t xml:space="preserve"> bei visų 3 algoritmų bandymo taškus</w:t>
+      </w:r>
+      <w:r>
+        <w:t xml:space="preserve"> (žr. </w:t>
+      </w:r>
+      <w:r>
+        <w:fldChar w:fldCharType="begin"/>
+      </w:r>
+      <w:r>
+        <w:instrText xml:space="preserve"> REF _Ref223298953 \h </w:instrText>
+      </w:r>
+      <w:r>
+        <w:fldChar w:fldCharType="separate"/>
+      </w:r>
+      <w:r>
+        <w:t>pav. 7</w:t>
+      </w:r>
+      <w:r>
+        <w:fldChar w:fldCharType="end"/>
+      </w:r>
+      <w:r>
+        <w:t>)</w:t>
+      </w:r>
+      <w:r>
+        <w:t xml:space="preserve">. Tam, kad taškai būtų lengviau matomi, </w:t>
       </w:r>
       <w:r>
         <w:rPr>
           <w:i/>
           <w:iCs/>
-          <w:lang w:val="en-US"/>
+        </w:rPr>
+        <w:t>x</w:t>
+      </w:r>
+      <w:r>
+        <w:t xml:space="preserve"> ir </w:t>
+      </w:r>
+      <w:r>
+        <w:rPr>
+          <w:i/>
+          <w:iCs/>
         </w:rPr>
         <w:t xml:space="preserve">f(x) </w:t>
       </w:r>
       <w:r>
-        <w:rPr>
-          <w:lang w:val="en-US"/>
-        </w:rPr>
-        <w:t>ašys reprezentuojamos logaritmišk</w:t>
-      </w:r>
-      <w:r>
-        <w:rPr>
-          <w:lang w:val="en-US"/>
-        </w:rPr>
-        <w:t>a</w:t>
-      </w:r>
-      <w:r>
-        <w:rPr>
-          <w:lang w:val="en-US"/>
-        </w:rPr>
-        <w:t xml:space="preserve"> skal</w:t>
-      </w:r>
-      <w:r>
-        <w:rPr>
-          <w:lang w:val="en-US"/>
-        </w:rPr>
-        <w:t>e</w:t>
-      </w:r>
-      <w:r>
-        <w:rPr>
-          <w:lang w:val="en-US"/>
-        </w:rPr>
+        <w:t xml:space="preserve">ašys reprezentuojamos </w:t>
+      </w:r>
+      <w:r>
+        <w:t>logaritmišk</w:t>
+      </w:r>
+      <w:r>
+        <w:t>ai</w:t>
+      </w:r>
+      <w:r>
         <w:t>.</w:t>
       </w:r>
     </w:p>
@@ -1898,9 +1785,7 @@
         <w:jc w:val="center"/>
       </w:pPr>
       <w:r>
-        <w:rPr>
-          <w:lang w:val="en-US"/>
-        </w:rPr>
+        <w:lastRenderedPageBreak/>
         <w:drawing>
           <wp:inline distT="0" distB="0" distL="0" distR="0" wp14:anchorId="2C5C2F9F" wp14:editId="5A958B1C">
             <wp:extent cx="5903596" cy="3542030"/>
@@ -1950,21 +1835,11 @@
       <w:r>
         <w:t xml:space="preserve">pav. </w:t>
       </w:r>
-      <w:r>
-        <w:fldChar w:fldCharType="begin"/>
-      </w:r>
-      <w:r>
-        <w:instrText xml:space="preserve"> SEQ pav. \* ARABIC </w:instrText>
-      </w:r>
-      <w:r>
-        <w:fldChar w:fldCharType="separate"/>
-      </w:r>
-      <w:r>
-        <w:t>7</w:t>
-      </w:r>
-      <w:r>
-        <w:fldChar w:fldCharType="end"/>
-      </w:r>
+      <w:fldSimple w:instr=" SEQ pav. \* ARABIC ">
+        <w:r>
+          <w:t>7</w:t>
+        </w:r>
+      </w:fldSimple>
       <w:bookmarkEnd w:id="8"/>
       <w:r>
         <w:t xml:space="preserve"> Tikslo funkcijos ir bandymo taškų grafikas</w:t>
@@ -3413,9 +3288,6 @@
     <w:name w:val="Normal"/>
     <w:qFormat/>
     <w:rsid w:val="00D55A07"/>
-    <w:rPr>
-      <w:noProof/>
-    </w:rPr>
   </w:style>
   <w:style w:type="paragraph" w:styleId="Heading1">
     <w:name w:val="heading 1"/>
@@ -3487,6 +3359,7 @@
   <w:style w:type="character" w:default="1" w:styleId="DefaultParagraphFont">
     <w:name w:val="Default Paragraph Font"/>
     <w:uiPriority w:val="1"/>
+    <w:semiHidden/>
     <w:unhideWhenUsed/>
   </w:style>
   <w:style w:type="table" w:default="1" w:styleId="TableNormal">

</xml_diff>